<commit_message>
PCDC resume: remove Maroon overlap with engagement-tracking bullet
Co-Authored-By: Claude Opus 5.5 <noreply@anthropic.com>
Claude-Session: https://claude.ai/code/session_01Rb4ZTXZXZvRymPmEXq9dPj
</commit_message>
<xml_diff>
--- a/resumes/Clavel_Lazarre_Resume_PCDC.docx
+++ b/resumes/Clavel_Lazarre_Resume_PCDC.docx
@@ -364,7 +364,7 @@
           <w:color w:val="222222"/>
           <w:sz w:val="21"/>
         </w:rPr>
-        <w:t>Build financial models, management dashboards, and standard operating procedures that help leadership assess performance, allocate resources, and improve delivery.</w:t>
+        <w:t>Build financial models, management dashboards, and standard operating procedures to support resource allocation and improve delivery.</w:t>
       </w:r>
     </w:p>
     <w:p>
@@ -422,7 +422,7 @@
           <w:color w:val="222222"/>
           <w:sz w:val="21"/>
         </w:rPr>
-        <w:t>Led proposal development and quality review for grant-funded and fee-for-service work; designed funder outcome reporting and formal partnership agreements with agencies, academic partners, and employers.</w:t>
+        <w:t>Led proposal development and quality review for grant-funded and fee-for-service work; developed formal partnership agreements with agencies, academic partners, and employers.</w:t>
       </w:r>
     </w:p>
     <w:p>

</xml_diff>